<commit_message>
feat(cctns): align seizure receipt to CCTNS Form IF4, add user rank/badge, and IIF export with mock receiver
Co-Authored-By: Claude Opus 4.8 (1M context) <noreply@anthropic.com>
</commit_message>
<xml_diff>
--- a/templates/seizure_receipt.docx
+++ b/templates/seizure_receipt.docx
@@ -12,7 +12,7 @@
           <w:b/>
           <w:sz w:val="28"/>
         </w:rPr>
-        <w:t>SEIZURE RECEIPT / જપ્તી પહોંચ</w:t>
+        <w:t>FORM IF4 — PROPERTY SEIZURE MEMO / જપ્તી પંચનામું</w:t>
       </w:r>
     </w:p>
     <w:p>
@@ -21,28 +21,88 @@
           <w:rFonts w:cs="Noto Sans Gujarati"/>
           <w:b w:val="0"/>
         </w:rPr>
-        <w:t>(Under the Bharatiya Nagarik Suraksha Sanhita, 2023)</w:t>
+        <w:t>(Crime &amp; Criminal Tracking Network and Systems · Bharatiya Nagarik Suraksha Sanhita, 2023)</w:t>
       </w:r>
     </w:p>
+    <w:p/>
+    <w:tbl>
+      <w:tblPr>
+        <w:tblStyle w:val="TableGrid"/>
+        <w:tblW w:type="auto" w:w="0"/>
+        <w:tblLook w:firstColumn="1" w:firstRow="1" w:lastColumn="0" w:lastRow="0" w:noHBand="0" w:noVBand="1" w:val="04A0"/>
+      </w:tblPr>
+      <w:tblGrid>
+        <w:gridCol w:w="4320"/>
+        <w:gridCol w:w="4320"/>
+      </w:tblGrid>
+      <w:tr>
+        <w:tc>
+          <w:tcPr>
+            <w:tcW w:type="dxa" w:w="4320"/>
+          </w:tcPr>
+          <w:p>
+            <w:r>
+              <w:rPr>
+                <w:rFonts w:cs="Noto Sans Gujarati"/>
+              </w:rPr>
+              <w:t>District: {{ district }}</w:t>
+            </w:r>
+          </w:p>
+        </w:tc>
+        <w:tc>
+          <w:tcPr>
+            <w:tcW w:type="dxa" w:w="4320"/>
+          </w:tcPr>
+          <w:p>
+            <w:r>
+              <w:rPr>
+                <w:rFonts w:cs="Noto Sans Gujarati"/>
+              </w:rPr>
+              <w:t>Police Station: {{ police_station }}</w:t>
+            </w:r>
+          </w:p>
+        </w:tc>
+      </w:tr>
+      <w:tr>
+        <w:tc>
+          <w:tcPr>
+            <w:tcW w:type="dxa" w:w="4320"/>
+          </w:tcPr>
+          <w:p>
+            <w:r>
+              <w:rPr>
+                <w:rFonts w:cs="Noto Sans Gujarati"/>
+              </w:rPr>
+              <w:t>Year: {{ fir_year }}    FIR No.: {{ fir_number }}</w:t>
+            </w:r>
+          </w:p>
+        </w:tc>
+        <w:tc>
+          <w:tcPr>
+            <w:tcW w:type="dxa" w:w="4320"/>
+          </w:tcPr>
+          <w:p>
+            <w:r>
+              <w:rPr>
+                <w:rFonts w:cs="Noto Sans Gujarati"/>
+              </w:rPr>
+              <w:t>Crime / Case No.: {{ case_number }}    FIR Date: {{ fir_date }}</w:t>
+            </w:r>
+          </w:p>
+        </w:tc>
+      </w:tr>
+    </w:tbl>
     <w:p/>
     <w:p>
       <w:r>
         <w:rPr>
           <w:rFonts w:cs="Noto Sans Gujarati"/>
-          <w:b w:val="0"/>
+          <w:b/>
         </w:rPr>
-        <w:t>Police Station: {{ police_station }}    District: {{ district }}</w:t>
+        <w:t>Acts &amp; Sections: {{ acts_sections_line }}</w:t>
       </w:r>
     </w:p>
-    <w:p>
-      <w:r>
-        <w:rPr>
-          <w:rFonts w:cs="Noto Sans Gujarati"/>
-          <w:b w:val="0"/>
-        </w:rPr>
-        <w:t>Case / FIR No.: {{ case_number }}  (FIR No. {{ fir_number }})</w:t>
-      </w:r>
-    </w:p>
+    <w:p/>
     <w:p>
       <w:r>
         <w:rPr>
@@ -66,9 +126,37 @@
       <w:r>
         <w:rPr>
           <w:rFonts w:cs="Noto Sans Gujarati"/>
+          <w:b/>
+        </w:rPr>
+        <w:t>Person from whom property seized:</w:t>
+      </w:r>
+    </w:p>
+    <w:p>
+      <w:r>
+        <w:rPr>
+          <w:rFonts w:cs="Noto Sans Gujarati"/>
           <w:b w:val="0"/>
         </w:rPr>
-        <w:t>The following article(s) were seized by {{ io_name }}, Investigating Officer, from the possession of {{ accused_name }} in connection with the above case, in the presence of the panch witnesses named below:</w:t>
+        <w:t>Name: {{ accused_name }}    S/o: {{ accused_father }}    Age: {{ accused_age }}</w:t>
+      </w:r>
+    </w:p>
+    <w:p>
+      <w:r>
+        <w:rPr>
+          <w:rFonts w:cs="Noto Sans Gujarati"/>
+          <w:b w:val="0"/>
+        </w:rPr>
+        <w:t>Address: {{ accused_address }}</w:t>
+      </w:r>
+    </w:p>
+    <w:p/>
+    <w:p>
+      <w:r>
+        <w:rPr>
+          <w:rFonts w:cs="Noto Sans Gujarati"/>
+          <w:b w:val="0"/>
+        </w:rPr>
+        <w:t>The property described below was seized by {{ io_name }}, Investigating Officer, in the presence of the two independent panch witnesses named below. Each article was packed and sealed as recorded:</w:t>
       </w:r>
     </w:p>
     <w:tbl>
@@ -78,15 +166,16 @@
         <w:tblLook w:firstColumn="1" w:firstRow="1" w:lastColumn="0" w:lastRow="0" w:noHBand="0" w:noVBand="1" w:val="04A0"/>
       </w:tblPr>
       <w:tblGrid>
-        <w:gridCol w:w="2160"/>
-        <w:gridCol w:w="2160"/>
-        <w:gridCol w:w="2160"/>
-        <w:gridCol w:w="2160"/>
+        <w:gridCol w:w="1728"/>
+        <w:gridCol w:w="1728"/>
+        <w:gridCol w:w="1728"/>
+        <w:gridCol w:w="1728"/>
+        <w:gridCol w:w="1728"/>
       </w:tblGrid>
       <w:tr>
         <w:tc>
           <w:tcPr>
-            <w:tcW w:type="dxa" w:w="2160"/>
+            <w:tcW w:type="dxa" w:w="1728"/>
           </w:tcPr>
           <w:p>
             <w:r>
@@ -94,13 +183,13 @@
                 <w:rFonts w:cs="Noto Sans Gujarati"/>
                 <w:b/>
               </w:rPr>
-              <w:t>No.</w:t>
+              <w:t>Sr.</w:t>
             </w:r>
           </w:p>
         </w:tc>
         <w:tc>
           <w:tcPr>
-            <w:tcW w:type="dxa" w:w="2160"/>
+            <w:tcW w:type="dxa" w:w="1728"/>
           </w:tcPr>
           <w:p>
             <w:r>
@@ -108,13 +197,13 @@
                 <w:rFonts w:cs="Noto Sans Gujarati"/>
                 <w:b/>
               </w:rPr>
-              <w:t>Description of article</w:t>
+              <w:t>Description of property</w:t>
             </w:r>
           </w:p>
         </w:tc>
         <w:tc>
           <w:tcPr>
-            <w:tcW w:type="dxa" w:w="2160"/>
+            <w:tcW w:type="dxa" w:w="1728"/>
           </w:tcPr>
           <w:p>
             <w:r>
@@ -122,13 +211,13 @@
                 <w:rFonts w:cs="Noto Sans Gujarati"/>
                 <w:b/>
               </w:rPr>
-              <w:t>Quantity</w:t>
+              <w:t>Qty</w:t>
             </w:r>
           </w:p>
         </w:tc>
         <w:tc>
           <w:tcPr>
-            <w:tcW w:type="dxa" w:w="2160"/>
+            <w:tcW w:type="dxa" w:w="1728"/>
           </w:tcPr>
           <w:p>
             <w:r>
@@ -136,7 +225,21 @@
                 <w:rFonts w:cs="Noto Sans Gujarati"/>
                 <w:b/>
               </w:rPr>
-              <w:t>Estimated value (Rs.)</w:t>
+              <w:t>Est. value (Rs.)</w:t>
+            </w:r>
+          </w:p>
+        </w:tc>
+        <w:tc>
+          <w:tcPr>
+            <w:tcW w:type="dxa" w:w="1728"/>
+          </w:tcPr>
+          <w:p>
+            <w:r>
+              <w:rPr>
+                <w:rFonts w:cs="Noto Sans Gujarati"/>
+                <w:b/>
+              </w:rPr>
+              <w:t>How packed &amp; sealed</w:t>
             </w:r>
           </w:p>
         </w:tc>
@@ -144,7 +247,7 @@
       <w:tr>
         <w:tc>
           <w:tcPr>
-            <w:tcW w:type="dxa" w:w="2160"/>
+            <w:tcW w:type="dxa" w:w="1728"/>
           </w:tcPr>
           <w:p>
             <w:r>
@@ -157,19 +260,25 @@
         </w:tc>
         <w:tc>
           <w:tcPr>
-            <w:tcW w:type="dxa" w:w="2160"/>
+            <w:tcW w:type="dxa" w:w="1728"/>
           </w:tcPr>
           <w:p/>
         </w:tc>
         <w:tc>
           <w:tcPr>
-            <w:tcW w:type="dxa" w:w="2160"/>
+            <w:tcW w:type="dxa" w:w="1728"/>
           </w:tcPr>
           <w:p/>
         </w:tc>
         <w:tc>
           <w:tcPr>
-            <w:tcW w:type="dxa" w:w="2160"/>
+            <w:tcW w:type="dxa" w:w="1728"/>
+          </w:tcPr>
+          <w:p/>
+        </w:tc>
+        <w:tc>
+          <w:tcPr>
+            <w:tcW w:type="dxa" w:w="1728"/>
           </w:tcPr>
           <w:p/>
         </w:tc>
@@ -177,7 +286,7 @@
       <w:tr>
         <w:tc>
           <w:tcPr>
-            <w:tcW w:type="dxa" w:w="2160"/>
+            <w:tcW w:type="dxa" w:w="1728"/>
           </w:tcPr>
           <w:p>
             <w:r>
@@ -190,7 +299,7 @@
         </w:tc>
         <w:tc>
           <w:tcPr>
-            <w:tcW w:type="dxa" w:w="2160"/>
+            <w:tcW w:type="dxa" w:w="1728"/>
           </w:tcPr>
           <w:p>
             <w:r>
@@ -203,7 +312,7 @@
         </w:tc>
         <w:tc>
           <w:tcPr>
-            <w:tcW w:type="dxa" w:w="2160"/>
+            <w:tcW w:type="dxa" w:w="1728"/>
           </w:tcPr>
           <w:p>
             <w:r>
@@ -216,7 +325,7 @@
         </w:tc>
         <w:tc>
           <w:tcPr>
-            <w:tcW w:type="dxa" w:w="2160"/>
+            <w:tcW w:type="dxa" w:w="1728"/>
           </w:tcPr>
           <w:p>
             <w:r>
@@ -227,11 +336,23 @@
             </w:r>
           </w:p>
         </w:tc>
+        <w:tc>
+          <w:tcPr>
+            <w:tcW w:type="dxa" w:w="1728"/>
+          </w:tcPr>
+          <w:p>
+            <w:r>
+              <w:rPr>
+                <w:rFonts w:cs="Noto Sans Gujarati"/>
+              </w:rPr>
+            </w:r>
+          </w:p>
+        </w:tc>
       </w:tr>
       <w:tr>
         <w:tc>
           <w:tcPr>
-            <w:tcW w:type="dxa" w:w="2160"/>
+            <w:tcW w:type="dxa" w:w="1728"/>
           </w:tcPr>
           <w:p>
             <w:r>
@@ -244,19 +365,25 @@
         </w:tc>
         <w:tc>
           <w:tcPr>
-            <w:tcW w:type="dxa" w:w="2160"/>
+            <w:tcW w:type="dxa" w:w="1728"/>
           </w:tcPr>
           <w:p/>
         </w:tc>
         <w:tc>
           <w:tcPr>
-            <w:tcW w:type="dxa" w:w="2160"/>
+            <w:tcW w:type="dxa" w:w="1728"/>
           </w:tcPr>
           <w:p/>
         </w:tc>
         <w:tc>
           <w:tcPr>
-            <w:tcW w:type="dxa" w:w="2160"/>
+            <w:tcW w:type="dxa" w:w="1728"/>
+          </w:tcPr>
+          <w:p/>
+        </w:tc>
+        <w:tc>
+          <w:tcPr>
+            <w:tcW w:type="dxa" w:w="1728"/>
           </w:tcPr>
           <w:p/>
         </w:tc>
@@ -269,7 +396,7 @@
           <w:rFonts w:cs="Noto Sans Gujarati"/>
           <w:b/>
         </w:rPr>
-        <w:t>Panch witnesses:</w:t>
+        <w:t>Specimen of seal used (affix impression below):</w:t>
       </w:r>
     </w:p>
     <w:tbl>
@@ -279,146 +406,23 @@
         <w:tblLook w:firstColumn="1" w:firstRow="1" w:lastColumn="0" w:lastRow="0" w:noHBand="0" w:noVBand="1" w:val="04A0"/>
       </w:tblPr>
       <w:tblGrid>
-        <w:gridCol w:w="2880"/>
-        <w:gridCol w:w="2880"/>
-        <w:gridCol w:w="2880"/>
+        <w:gridCol w:w="8640"/>
       </w:tblGrid>
       <w:tr>
         <w:tc>
           <w:tcPr>
-            <w:tcW w:type="dxa" w:w="2880"/>
-          </w:tcPr>
-          <w:p>
-            <w:r>
-              <w:rPr>
-                <w:rFonts w:cs="Noto Sans Gujarati"/>
-                <w:b/>
-              </w:rPr>
-              <w:t>No.</w:t>
-            </w:r>
-          </w:p>
-        </w:tc>
-        <w:tc>
-          <w:tcPr>
-            <w:tcW w:type="dxa" w:w="2880"/>
-          </w:tcPr>
-          <w:p>
-            <w:r>
-              <w:rPr>
-                <w:rFonts w:cs="Noto Sans Gujarati"/>
-                <w:b/>
-              </w:rPr>
-              <w:t>Name</w:t>
-            </w:r>
-          </w:p>
-        </w:tc>
-        <w:tc>
-          <w:tcPr>
-            <w:tcW w:type="dxa" w:w="2880"/>
-          </w:tcPr>
-          <w:p>
-            <w:r>
-              <w:rPr>
-                <w:rFonts w:cs="Noto Sans Gujarati"/>
-                <w:b/>
-              </w:rPr>
-              <w:t>Address</w:t>
-            </w:r>
-          </w:p>
-        </w:tc>
-      </w:tr>
-      <w:tr>
-        <w:tc>
-          <w:tcPr>
-            <w:tcW w:type="dxa" w:w="2880"/>
+            <w:tcW w:type="dxa" w:w="8640"/>
           </w:tcPr>
           <w:p>
             <w:r>
               <w:rPr>
                 <w:rFonts w:cs="Noto Sans Gujarati"/>
               </w:rPr>
-              <w:t>{%tr for w in witnesses %}</w:t>
             </w:r>
           </w:p>
-        </w:tc>
-        <w:tc>
-          <w:tcPr>
-            <w:tcW w:type="dxa" w:w="2880"/>
-          </w:tcPr>
           <w:p/>
-        </w:tc>
-        <w:tc>
-          <w:tcPr>
-            <w:tcW w:type="dxa" w:w="2880"/>
-          </w:tcPr>
           <w:p/>
-        </w:tc>
-      </w:tr>
-      <w:tr>
-        <w:tc>
-          <w:tcPr>
-            <w:tcW w:type="dxa" w:w="2880"/>
-          </w:tcPr>
-          <w:p>
-            <w:r>
-              <w:rPr>
-                <w:rFonts w:cs="Noto Sans Gujarati"/>
-              </w:rPr>
-              <w:t>{{ loop.index }}</w:t>
-            </w:r>
-          </w:p>
-        </w:tc>
-        <w:tc>
-          <w:tcPr>
-            <w:tcW w:type="dxa" w:w="2880"/>
-          </w:tcPr>
-          <w:p>
-            <w:r>
-              <w:rPr>
-                <w:rFonts w:cs="Noto Sans Gujarati"/>
-              </w:rPr>
-              <w:t>{{ w.full_name }}</w:t>
-            </w:r>
-          </w:p>
-        </w:tc>
-        <w:tc>
-          <w:tcPr>
-            <w:tcW w:type="dxa" w:w="2880"/>
-          </w:tcPr>
-          <w:p>
-            <w:r>
-              <w:rPr>
-                <w:rFonts w:cs="Noto Sans Gujarati"/>
-              </w:rPr>
-              <w:t>{{ w.address }}</w:t>
-            </w:r>
-          </w:p>
-        </w:tc>
-      </w:tr>
-      <w:tr>
-        <w:tc>
-          <w:tcPr>
-            <w:tcW w:type="dxa" w:w="2880"/>
-          </w:tcPr>
-          <w:p>
-            <w:r>
-              <w:rPr>
-                <w:rFonts w:cs="Noto Sans Gujarati"/>
-              </w:rPr>
-              <w:t>{%tr endfor %}</w:t>
-            </w:r>
-          </w:p>
-        </w:tc>
-        <w:tc>
-          <w:tcPr>
-            <w:tcW w:type="dxa" w:w="2880"/>
-          </w:tcPr>
           <w:p/>
-        </w:tc>
-        <w:tc>
-          <w:tcPr>
-            <w:tcW w:type="dxa" w:w="2880"/>
-          </w:tcPr>
           <w:p/>
         </w:tc>
       </w:tr>
@@ -428,55 +432,76 @@
       <w:r>
         <w:rPr>
           <w:rFonts w:cs="Noto Sans Gujarati"/>
+          <w:b/>
+        </w:rPr>
+        <w:t>Independent panch witnesses:</w:t>
+      </w:r>
+    </w:p>
+    <w:p>
+      <w:r>
+        <w:rPr>
+          <w:rFonts w:cs="Noto Sans Gujarati"/>
           <w:b w:val="0"/>
         </w:rPr>
-        <w:t>The above articles have been correctly listed and seized in my presence.</w:t>
+        <w:t>1. Name: {{ witness1.full_name }}    S/o: {{ witness1.father_name }}</w:t>
+      </w:r>
+    </w:p>
+    <w:p>
+      <w:r>
+        <w:rPr>
+          <w:rFonts w:cs="Noto Sans Gujarati"/>
+          <w:b w:val="0"/>
+        </w:rPr>
+        <w:t xml:space="preserve">   Address: {{ witness1.address }}          Signature: ____________________</w:t>
+      </w:r>
+    </w:p>
+    <w:p>
+      <w:r>
+        <w:rPr>
+          <w:rFonts w:cs="Noto Sans Gujarati"/>
+          <w:b w:val="0"/>
+        </w:rPr>
+        <w:t>2. Name: {{ witness2.full_name }}    S/o: {{ witness2.father_name }}</w:t>
+      </w:r>
+    </w:p>
+    <w:p>
+      <w:r>
+        <w:rPr>
+          <w:rFonts w:cs="Noto Sans Gujarati"/>
+          <w:b w:val="0"/>
+        </w:rPr>
+        <w:t xml:space="preserve">   Address: {{ witness2.address }}          Signature: ____________________</w:t>
       </w:r>
     </w:p>
     <w:p/>
-    <w:tbl>
-      <w:tblPr>
-        <w:tblW w:type="auto" w:w="0"/>
-        <w:tblLook w:firstColumn="1" w:firstRow="1" w:lastColumn="0" w:lastRow="0" w:noHBand="0" w:noVBand="1" w:val="04A0"/>
-      </w:tblPr>
-      <w:tblGrid>
-        <w:gridCol w:w="4320"/>
-        <w:gridCol w:w="4320"/>
-      </w:tblGrid>
-      <w:tr>
-        <w:tc>
-          <w:tcPr>
-            <w:tcW w:type="dxa" w:w="4320"/>
-          </w:tcPr>
-          <w:p>
-            <w:r>
-              <w:rPr>
-                <w:rFonts w:cs="Noto Sans Gujarati"/>
-              </w:rPr>
-              <w:t>Panch witnesses (sign)</w:t>
-            </w:r>
-          </w:p>
-        </w:tc>
-        <w:tc>
-          <w:tcPr>
-            <w:tcW w:type="dxa" w:w="4320"/>
-          </w:tcPr>
-          <w:p>
-            <w:pPr>
-              <w:jc w:val="right"/>
-            </w:pPr>
-            <w:r>
-              <w:rPr>
-                <w:rFonts w:cs="Noto Sans Gujarati"/>
-              </w:rPr>
-              <w:t>{{ io_name }}</w:t>
-              <w:br/>
-              <w:t>Investigating Officer</w:t>
-            </w:r>
-          </w:p>
-        </w:tc>
-      </w:tr>
-    </w:tbl>
+    <w:p>
+      <w:r>
+        <w:rPr>
+          <w:rFonts w:cs="Noto Sans Gujarati"/>
+          <w:b/>
+        </w:rPr>
+        <w:t>Seizing / Investigating Officer:</w:t>
+      </w:r>
+    </w:p>
+    <w:p>
+      <w:r>
+        <w:rPr>
+          <w:rFonts w:cs="Noto Sans Gujarati"/>
+          <w:b w:val="0"/>
+        </w:rPr>
+        <w:t>Name: {{ io_name }}    Rank: {{ io_rank }}    Buckle (Badge) No.: {{ io_badge_no }}</w:t>
+      </w:r>
+    </w:p>
+    <w:p>
+      <w:r>
+        <w:rPr>
+          <w:rFonts w:cs="Noto Sans Gujarati"/>
+          <w:b w:val="0"/>
+        </w:rPr>
+        <w:t>Police Station: {{ police_station }}          Signature: ____________________</w:t>
+      </w:r>
+    </w:p>
+    <w:p/>
     <w:p>
       <w:r>
         <w:rPr>

</xml_diff>

<commit_message>
fix(translate): eliminate prompt leakage and script contamination with output validation and fallback; fix money formatting and document layout issues
Co-Authored-By: Claude Opus 4.8 (1M context) <noreply@anthropic.com>
</commit_message>
<xml_diff>
--- a/templates/seizure_receipt.docx
+++ b/templates/seizure_receipt.docx
@@ -156,7 +156,7 @@
           <w:rFonts w:cs="Noto Sans Gujarati"/>
           <w:b w:val="0"/>
         </w:rPr>
-        <w:t>The property described below was seized by {{ io_name }}, Investigating Officer, in the presence of the two independent panch witnesses named below. Each article was packed and sealed as recorded:</w:t>
+        <w:t>The property described below was seized by {{ io_name }}, Investigating Officer, in the presence of the two independent panch witnesses named below, and each article was thereafter packed and sealed:</w:t>
       </w:r>
     </w:p>
     <w:tbl>
@@ -166,16 +166,15 @@
         <w:tblLook w:firstColumn="1" w:firstRow="1" w:lastColumn="0" w:lastRow="0" w:noHBand="0" w:noVBand="1" w:val="04A0"/>
       </w:tblPr>
       <w:tblGrid>
-        <w:gridCol w:w="1728"/>
-        <w:gridCol w:w="1728"/>
-        <w:gridCol w:w="1728"/>
-        <w:gridCol w:w="1728"/>
-        <w:gridCol w:w="1728"/>
+        <w:gridCol w:w="2160"/>
+        <w:gridCol w:w="2160"/>
+        <w:gridCol w:w="2160"/>
+        <w:gridCol w:w="2160"/>
       </w:tblGrid>
       <w:tr>
         <w:tc>
           <w:tcPr>
-            <w:tcW w:type="dxa" w:w="1728"/>
+            <w:tcW w:type="dxa" w:w="2160"/>
           </w:tcPr>
           <w:p>
             <w:r>
@@ -189,7 +188,7 @@
         </w:tc>
         <w:tc>
           <w:tcPr>
-            <w:tcW w:type="dxa" w:w="1728"/>
+            <w:tcW w:type="dxa" w:w="2160"/>
           </w:tcPr>
           <w:p>
             <w:r>
@@ -203,7 +202,7 @@
         </w:tc>
         <w:tc>
           <w:tcPr>
-            <w:tcW w:type="dxa" w:w="1728"/>
+            <w:tcW w:type="dxa" w:w="2160"/>
           </w:tcPr>
           <w:p>
             <w:r>
@@ -217,7 +216,7 @@
         </w:tc>
         <w:tc>
           <w:tcPr>
-            <w:tcW w:type="dxa" w:w="1728"/>
+            <w:tcW w:type="dxa" w:w="2160"/>
           </w:tcPr>
           <w:p>
             <w:r>
@@ -225,21 +224,7 @@
                 <w:rFonts w:cs="Noto Sans Gujarati"/>
                 <w:b/>
               </w:rPr>
-              <w:t>Est. value (Rs.)</w:t>
-            </w:r>
-          </w:p>
-        </w:tc>
-        <w:tc>
-          <w:tcPr>
-            <w:tcW w:type="dxa" w:w="1728"/>
-          </w:tcPr>
-          <w:p>
-            <w:r>
-              <w:rPr>
-                <w:rFonts w:cs="Noto Sans Gujarati"/>
-                <w:b/>
-              </w:rPr>
-              <w:t>How packed &amp; sealed</w:t>
+              <w:t>Est. value</w:t>
             </w:r>
           </w:p>
         </w:tc>
@@ -247,7 +232,7 @@
       <w:tr>
         <w:tc>
           <w:tcPr>
-            <w:tcW w:type="dxa" w:w="1728"/>
+            <w:tcW w:type="dxa" w:w="2160"/>
           </w:tcPr>
           <w:p>
             <w:r>
@@ -260,25 +245,19 @@
         </w:tc>
         <w:tc>
           <w:tcPr>
-            <w:tcW w:type="dxa" w:w="1728"/>
+            <w:tcW w:type="dxa" w:w="2160"/>
           </w:tcPr>
           <w:p/>
         </w:tc>
         <w:tc>
           <w:tcPr>
-            <w:tcW w:type="dxa" w:w="1728"/>
+            <w:tcW w:type="dxa" w:w="2160"/>
           </w:tcPr>
           <w:p/>
         </w:tc>
         <w:tc>
           <w:tcPr>
-            <w:tcW w:type="dxa" w:w="1728"/>
-          </w:tcPr>
-          <w:p/>
-        </w:tc>
-        <w:tc>
-          <w:tcPr>
-            <w:tcW w:type="dxa" w:w="1728"/>
+            <w:tcW w:type="dxa" w:w="2160"/>
           </w:tcPr>
           <w:p/>
         </w:tc>
@@ -286,7 +265,7 @@
       <w:tr>
         <w:tc>
           <w:tcPr>
-            <w:tcW w:type="dxa" w:w="1728"/>
+            <w:tcW w:type="dxa" w:w="2160"/>
           </w:tcPr>
           <w:p>
             <w:r>
@@ -299,7 +278,7 @@
         </w:tc>
         <w:tc>
           <w:tcPr>
-            <w:tcW w:type="dxa" w:w="1728"/>
+            <w:tcW w:type="dxa" w:w="2160"/>
           </w:tcPr>
           <w:p>
             <w:r>
@@ -312,7 +291,7 @@
         </w:tc>
         <w:tc>
           <w:tcPr>
-            <w:tcW w:type="dxa" w:w="1728"/>
+            <w:tcW w:type="dxa" w:w="2160"/>
           </w:tcPr>
           <w:p>
             <w:r>
@@ -325,7 +304,7 @@
         </w:tc>
         <w:tc>
           <w:tcPr>
-            <w:tcW w:type="dxa" w:w="1728"/>
+            <w:tcW w:type="dxa" w:w="2160"/>
           </w:tcPr>
           <w:p>
             <w:r>
@@ -336,23 +315,11 @@
             </w:r>
           </w:p>
         </w:tc>
-        <w:tc>
-          <w:tcPr>
-            <w:tcW w:type="dxa" w:w="1728"/>
-          </w:tcPr>
-          <w:p>
-            <w:r>
-              <w:rPr>
-                <w:rFonts w:cs="Noto Sans Gujarati"/>
-              </w:rPr>
-            </w:r>
-          </w:p>
-        </w:tc>
       </w:tr>
       <w:tr>
         <w:tc>
           <w:tcPr>
-            <w:tcW w:type="dxa" w:w="1728"/>
+            <w:tcW w:type="dxa" w:w="2160"/>
           </w:tcPr>
           <w:p>
             <w:r>
@@ -365,64 +332,20 @@
         </w:tc>
         <w:tc>
           <w:tcPr>
-            <w:tcW w:type="dxa" w:w="1728"/>
+            <w:tcW w:type="dxa" w:w="2160"/>
           </w:tcPr>
           <w:p/>
         </w:tc>
         <w:tc>
           <w:tcPr>
-            <w:tcW w:type="dxa" w:w="1728"/>
+            <w:tcW w:type="dxa" w:w="2160"/>
           </w:tcPr>
           <w:p/>
         </w:tc>
         <w:tc>
           <w:tcPr>
-            <w:tcW w:type="dxa" w:w="1728"/>
+            <w:tcW w:type="dxa" w:w="2160"/>
           </w:tcPr>
-          <w:p/>
-        </w:tc>
-        <w:tc>
-          <w:tcPr>
-            <w:tcW w:type="dxa" w:w="1728"/>
-          </w:tcPr>
-          <w:p/>
-        </w:tc>
-      </w:tr>
-    </w:tbl>
-    <w:p/>
-    <w:p>
-      <w:r>
-        <w:rPr>
-          <w:rFonts w:cs="Noto Sans Gujarati"/>
-          <w:b/>
-        </w:rPr>
-        <w:t>Specimen of seal used (affix impression below):</w:t>
-      </w:r>
-    </w:p>
-    <w:tbl>
-      <w:tblPr>
-        <w:tblStyle w:val="TableGrid"/>
-        <w:tblW w:type="auto" w:w="0"/>
-        <w:tblLook w:firstColumn="1" w:firstRow="1" w:lastColumn="0" w:lastRow="0" w:noHBand="0" w:noVBand="1" w:val="04A0"/>
-      </w:tblPr>
-      <w:tblGrid>
-        <w:gridCol w:w="8640"/>
-      </w:tblGrid>
-      <w:tr>
-        <w:tc>
-          <w:tcPr>
-            <w:tcW w:type="dxa" w:w="8640"/>
-          </w:tcPr>
-          <w:p>
-            <w:r>
-              <w:rPr>
-                <w:rFonts w:cs="Noto Sans Gujarati"/>
-              </w:rPr>
-            </w:r>
-          </w:p>
-          <w:p/>
-          <w:p/>
-          <w:p/>
           <w:p/>
         </w:tc>
       </w:tr>

</xml_diff>